<commit_message>
Update project proposal doc
</commit_message>
<xml_diff>
--- a/phase1/Project_Proposal.docx
+++ b/phase1/Project_Proposal.docx
@@ -89,6 +89,9 @@
       <w:r>
         <w:t>Current Skills:</w:t>
       </w:r>
+      <w:r>
+        <w:t xml:space="preserve"> Writing, Research, Business Analytics</w:t>
+      </w:r>
     </w:p>
     <w:p>
       <w:pPr>
@@ -97,6 +100,9 @@
       <w:r>
         <w:t xml:space="preserve">Areas to grow into: </w:t>
       </w:r>
+      <w:r>
+        <w:t>Python Programming, Fetching data from REST APIs</w:t>
+      </w:r>
     </w:p>
     <w:p>
       <w:pPr>
@@ -115,11 +121,17 @@
       <w:r>
         <w:t>Current Skills:</w:t>
       </w:r>
+      <w:r>
+        <w:t xml:space="preserve"> Python, EDAs, Data Visualization</w:t>
+      </w:r>
     </w:p>
     <w:p>
       <w:r>
         <w:t>Areas to grow into:</w:t>
       </w:r>
+      <w:r>
+        <w:t xml:space="preserve"> Retrieving data from APIs and Web Scraping</w:t>
+      </w:r>
     </w:p>
     <w:p/>
     <w:p>
@@ -138,7 +150,7 @@
         <w:t xml:space="preserve">Current Skills: </w:t>
       </w:r>
       <w:r>
-        <w:t xml:space="preserve">Python programming, APIs proficiency, </w:t>
+        <w:t>Python programming, APIs proficiency</w:t>
       </w:r>
     </w:p>
     <w:p>

</xml_diff>